<commit_message>
Update authentication, whitelist .env files, and add new artifacts
</commit_message>
<xml_diff>
--- a/PROJECT_DOCUMENTATION.docx
+++ b/PROJECT_DOCUMENTATION.docx
@@ -91,6 +91,11 @@
         <w:t xml:space="preserve">2802394670</w:t>
         <w:tab/>
         <w:t xml:space="preserve">Revan Marfrando Cokro</w:t>
+      </w:r>
+      <w:r>
+        <w:rPr>
+          <w:rtl w:val="0"/>
+        </w:rPr>
       </w:r>
     </w:p>
     <w:p>
@@ -358,7 +363,7 @@
           <w:vertAlign w:val="baseline"/>
           <w:rtl w:val="0"/>
         </w:rPr>
-        <w:t xml:space="preserve">A secure Node.js + Express.js backend executing robust bearer-authentication guards and mock OAuth workflows.</w:t>
+        <w:t xml:space="preserve">A secure Node.js + Express.js backend executing robust bearer-authentication guards and OAuth workflows.</w:t>
       </w:r>
     </w:p>
     <w:p>
@@ -2992,7 +2997,7 @@
                 <w:vertAlign w:val="baseline"/>
                 <w:rtl w:val="0"/>
               </w:rPr>
-              <w:t xml:space="preserve">Simulates external Google/Facebook sign-in, auto-registering new OAuth emails.</w:t>
+              <w:t xml:space="preserve">auto-registering new OAuth emails.</w:t>
             </w:r>
           </w:p>
         </w:tc>
@@ -4760,6 +4765,60 @@
     </w:p>
     <w:p>
       <w:pPr>
+        <w:keepNext w:val="0"/>
+        <w:keepLines w:val="0"/>
+        <w:pageBreakBefore w:val="0"/>
+        <w:widowControl w:val="0"/>
+        <w:pBdr>
+          <w:top w:space="0" w:sz="0" w:val="nil"/>
+          <w:left w:space="0" w:sz="0" w:val="nil"/>
+          <w:bottom w:space="0" w:sz="0" w:val="nil"/>
+          <w:right w:space="0" w:sz="0" w:val="nil"/>
+          <w:between w:space="0" w:sz="0" w:val="nil"/>
+        </w:pBdr>
+        <w:shd w:fill="auto" w:val="clear"/>
+        <w:spacing w:after="140" w:before="0" w:line="276" w:lineRule="auto"/>
+        <w:ind w:left="0" w:right="0" w:firstLine="0"/>
+        <w:jc w:val="left"/>
+        <w:rPr>
+          <w:rFonts w:ascii="Times New Roman" w:cs="Times New Roman" w:eastAsia="Times New Roman" w:hAnsi="Times New Roman"/>
+        </w:rPr>
+      </w:pPr>
+      <w:r>
+        <w:rPr>
+          <w:rtl w:val="0"/>
+        </w:rPr>
+      </w:r>
+    </w:p>
+    <w:p>
+      <w:pPr>
+        <w:keepNext w:val="0"/>
+        <w:keepLines w:val="0"/>
+        <w:pageBreakBefore w:val="0"/>
+        <w:widowControl w:val="0"/>
+        <w:pBdr>
+          <w:top w:space="0" w:sz="0" w:val="nil"/>
+          <w:left w:space="0" w:sz="0" w:val="nil"/>
+          <w:bottom w:space="0" w:sz="0" w:val="nil"/>
+          <w:right w:space="0" w:sz="0" w:val="nil"/>
+          <w:between w:space="0" w:sz="0" w:val="nil"/>
+        </w:pBdr>
+        <w:shd w:fill="auto" w:val="clear"/>
+        <w:spacing w:after="140" w:before="0" w:line="276" w:lineRule="auto"/>
+        <w:ind w:left="0" w:right="0" w:firstLine="0"/>
+        <w:jc w:val="left"/>
+        <w:rPr>
+          <w:rFonts w:ascii="Times New Roman" w:cs="Times New Roman" w:eastAsia="Times New Roman" w:hAnsi="Times New Roman"/>
+        </w:rPr>
+      </w:pPr>
+      <w:r>
+        <w:rPr>
+          <w:rtl w:val="0"/>
+        </w:rPr>
+      </w:r>
+    </w:p>
+    <w:p>
+      <w:pPr>
         <w:pStyle w:val="Heading2"/>
         <w:numPr>
           <w:ilvl w:val="1"/>
@@ -4938,7 +4997,29 @@
           <w:vertAlign w:val="baseline"/>
           <w:rtl w:val="0"/>
         </w:rPr>
-        <w:t xml:space="preserve">Token Guard Middleware: The /api/items endpoints are protected by verifyToken middleware, parsing the incoming Authorization header (Bearer &lt;token&gt;). Non-admin requests attempting write actions are blocked with a 403 Forbidden error.</w:t>
+        <w:t xml:space="preserve">Token Guard Middleware: The /api/items endpoints are protected by verifyToken middleware, parsing the incoming Authorization header (Bearer </w:t>
+      </w:r>
+      <w:r>
+        <w:rPr>
+          <w:rFonts w:ascii="Times New Roman" w:cs="Times New Roman" w:eastAsia="Times New Roman" w:hAnsi="Times New Roman"/>
+          <w:rtl w:val="0"/>
+        </w:rPr>
+        <w:t xml:space="preserve">t</w:t>
+      </w:r>
+      <w:r>
+        <w:rPr>
+          <w:rFonts w:ascii="Times New Roman" w:cs="Times New Roman" w:eastAsia="Times New Roman" w:hAnsi="Times New Roman"/>
+          <w:i w:val="0"/>
+          <w:iCs w:val="0"/>
+          <w:smallCaps w:val="0"/>
+          <w:strike w:val="0"/>
+          <w:color w:val="000000"/>
+          <w:u w:val="none"/>
+          <w:shd w:fill="auto" w:val="clear"/>
+          <w:vertAlign w:val="baseline"/>
+          <w:rtl w:val="0"/>
+        </w:rPr>
+        <w:t xml:space="preserve">oken). Non-admin requests attempting write actions are blocked with a 403 Forbidden error.</w:t>
       </w:r>
     </w:p>
     <w:p>
@@ -4991,7 +5072,7 @@
           <w:vertAlign w:val="baseline"/>
           <w:rtl w:val="0"/>
         </w:rPr>
-        <w:t xml:space="preserve">External OAuth Flow (Google/Facebook): Standardized OAuth simulation automatically handles profile matching. In cases where the user logins via external OAuth for the first time, the server generates a randomized secure password, inserts the user row as a standard traveler, and returns a session Bearer Token instantly.</w:t>
+        <w:t xml:space="preserve">External OAuth Flow (Google): Standardized OAuth automatically handles profile matching. In cases where the user logins via external OAuth for the first time, the server generates a randomized secure password, inserts the user row as a standard traveler, and returns a session Bearer Token instantly.</w:t>
       </w:r>
       <w:r>
         <w:rPr>
@@ -5099,7 +5180,29 @@
           <w:vertAlign w:val="baseline"/>
           <w:rtl w:val="0"/>
         </w:rPr>
-        <w:t xml:space="preserve">Visual Elements: Dynamic background gradient, a mystic floating star icon, credentials card, and distinct red and blue buttons for Google and Facebook login.</w:t>
+        <w:t xml:space="preserve">Visual Elements: Dynamic background gradient, a mystic floating star icon, credentials card, and distinct buttons </w:t>
+      </w:r>
+      <w:r>
+        <w:rPr>
+          <w:rFonts w:ascii="Times New Roman" w:cs="Times New Roman" w:eastAsia="Times New Roman" w:hAnsi="Times New Roman"/>
+          <w:rtl w:val="0"/>
+        </w:rPr>
+        <w:t xml:space="preserve">for</w:t>
+      </w:r>
+      <w:r>
+        <w:rPr>
+          <w:rFonts w:ascii="Times New Roman" w:cs="Times New Roman" w:eastAsia="Times New Roman" w:hAnsi="Times New Roman"/>
+          <w:i w:val="0"/>
+          <w:iCs w:val="0"/>
+          <w:smallCaps w:val="0"/>
+          <w:strike w:val="0"/>
+          <w:color w:val="000000"/>
+          <w:u w:val="none"/>
+          <w:shd w:fill="auto" w:val="clear"/>
+          <w:vertAlign w:val="baseline"/>
+          <w:rtl w:val="0"/>
+        </w:rPr>
+        <w:t xml:space="preserve"> Google login.</w:t>
       </w:r>
     </w:p>
     <w:p>
@@ -6194,7 +6297,7 @@
           <w:rFonts w:ascii="Times New Roman" w:cs="Times New Roman" w:eastAsia="Times New Roman" w:hAnsi="Times New Roman"/>
           <w:rtl w:val="0"/>
         </w:rPr>
-        <w:t xml:space="preserve">d</w:t>
+        <w:t xml:space="preserve">display</w:t>
       </w:r>
       <w:r>
         <w:rPr>
@@ -6209,7 +6312,7 @@
           <w:vertAlign w:val="baseline"/>
           <w:rtl w:val="0"/>
         </w:rPr>
-        <w:t xml:space="preserve">isplays accurate error details.</w:t>
+        <w:t xml:space="preserve"> accurate error details.</w:t>
       </w:r>
     </w:p>
     <w:p>
@@ -6407,15 +6510,15 @@
         <w:ind w:left="0" w:firstLine="0"/>
         <w:rPr>
           <w:rFonts w:ascii="Times New Roman" w:cs="Times New Roman" w:eastAsia="Times New Roman" w:hAnsi="Times New Roman"/>
-          <w:sz w:val="34"/>
-          <w:szCs w:val="34"/>
-        </w:rPr>
-      </w:pPr>
-      <w:r>
-        <w:rPr>
-          <w:rFonts w:ascii="Times New Roman" w:cs="Times New Roman" w:eastAsia="Times New Roman" w:hAnsi="Times New Roman"/>
-          <w:sz w:val="34"/>
-          <w:szCs w:val="34"/>
+          <w:sz w:val="44"/>
+          <w:szCs w:val="44"/>
+        </w:rPr>
+      </w:pPr>
+      <w:r>
+        <w:rPr>
+          <w:rFonts w:ascii="Times New Roman" w:cs="Times New Roman" w:eastAsia="Times New Roman" w:hAnsi="Times New Roman"/>
+          <w:sz w:val="44"/>
+          <w:szCs w:val="44"/>
           <w:rtl w:val="0"/>
         </w:rPr>
         <w:t xml:space="preserve">STEP-BY-STEP USER SETUP INSTRUCTIONS</w:t>

</xml_diff>